<commit_message>
chore: update availability — serving notice, LWD 22 Oct 2026
Replace the "90-day notice" copy with the concrete notice-period end date
so recruiters see a real start date instead of an open-ended window.

- lib/regionCopy.ts: hero / contact-footer / contact-terminal availability line
- data/resume.ts: noticePeriod field
- regenerate public/downloads DOCX from the new data
</commit_message>
<xml_diff>
--- a/public/downloads/anirudh-vaka-resume-universal.docx
+++ b/public/downloads/anirudh-vaka-resume-universal.docx
@@ -39,7 +39,7 @@
       <w:pPr>
         <w:spacing w:after="40"/>
       </w:pPr>
-      <w:hyperlink w:history="1" r:id="rId2ve0n0xy5w6oik3hlbrxq">
+      <w:hyperlink w:history="1" r:id="rId6ge2ncb-mxzuvb_n8o7tn">
         <w:r>
           <w:rPr>
             <w:u w:val="single"/>
@@ -60,7 +60,7 @@
         </w:rPr>
         <w:t xml:space="preserve"> | </w:t>
       </w:r>
-      <w:hyperlink w:history="1" r:id="rIdnm6taiogj6hisq1tltjnk">
+      <w:hyperlink w:history="1" r:id="rIdfastgn6wwol2es4ji53sm">
         <w:r>
           <w:rPr>
             <w:u w:val="single"/>
@@ -81,7 +81,7 @@
         </w:rPr>
         <w:t xml:space="preserve"> | </w:t>
       </w:r>
-      <w:hyperlink w:history="1" r:id="rIdq2oullsylt-ntkc1k8f5y">
+      <w:hyperlink w:history="1" r:id="rIddpr45zyxwzew-u4puxwgv">
         <w:r>
           <w:rPr>
             <w:u w:val="single"/>
@@ -116,7 +116,7 @@
         </w:rPr>
         <w:t xml:space="preserve"> | </w:t>
       </w:r>
-      <w:hyperlink w:history="1" r:id="rId4ti-bd1llvrzpq-pdznhz">
+      <w:hyperlink w:history="1" r:id="rIdqesgwq63ormlsdhtggt39">
         <w:r>
           <w:rPr>
             <w:u w:val="single"/>
@@ -137,7 +137,7 @@
         </w:rPr>
         <w:t xml:space="preserve"> | </w:t>
       </w:r>
-      <w:hyperlink w:history="1" r:id="rIdlfp_ohd2uvo6ebfgmmgox">
+      <w:hyperlink w:history="1" r:id="rIdygygl1k-azzemqwzcc_h1">
         <w:r>
           <w:rPr>
             <w:u w:val="single"/>
@@ -163,7 +163,7 @@
           <w:szCs w:val="20"/>
           <w:rFonts w:ascii="Calibri" w:cs="Calibri" w:eastAsia="Calibri" w:hAnsi="Calibri"/>
         </w:rPr>
-        <w:t xml:space="preserve">Open to relocation worldwide with visa sponsorship, or fully remote · Notice period: 90 days (negotiable)</w:t>
+        <w:t xml:space="preserve">Open to relocation worldwide with visa sponsorship, or fully remote · Notice period: Serving notice — last working day 22 Oct 2026</w:t>
       </w:r>
     </w:p>
     <w:p>
@@ -852,7 +852,7 @@
         </w:rPr>
         <w:t xml:space="preserve">Founder &amp; Engineer — </w:t>
       </w:r>
-      <w:hyperlink w:history="1" r:id="rIdgec8b_bkvnoi-wfxe5os_">
+      <w:hyperlink w:history="1" r:id="rId3qv5jffz3bxffhmuoef2y">
         <w:r>
           <w:rPr>
             <w:b/>
@@ -917,7 +917,7 @@
         </w:rPr>
         <w:t xml:space="preserve">Founder &amp; Engineer — </w:t>
       </w:r>
-      <w:hyperlink w:history="1" r:id="rIdomhczuwiyzvghf-7u0cbs">
+      <w:hyperlink w:history="1" r:id="rIdjy0wrur1bq1h5ixqyoppw">
         <w:r>
           <w:rPr>
             <w:b/>

</xml_diff>

<commit_message>
fix: drop the prepatlas.in/engineering links, the page is gone
Removes the Writeups entry, the resume blurb's trailing pointer, and
the sideProject's engineeringWriteupUrl. The card's "Engineering
deep-dive" CTA is already conditional on that field, so it hides
itself; the field stays on the interface for HumanifyCV's pending one.
</commit_message>
<xml_diff>
--- a/public/downloads/anirudh-vaka-resume-universal.docx
+++ b/public/downloads/anirudh-vaka-resume-universal.docx
@@ -39,7 +39,7 @@
       <w:pPr>
         <w:spacing w:after="40"/>
       </w:pPr>
-      <w:hyperlink w:history="1" r:id="rId-eo_zdzdnmdoeztw1aajz">
+      <w:hyperlink w:history="1" r:id="rId55uxdxle-kon8zofklupe">
         <w:r>
           <w:rPr>
             <w:u w:val="single"/>
@@ -60,7 +60,7 @@
         </w:rPr>
         <w:t xml:space="preserve"> | </w:t>
       </w:r>
-      <w:hyperlink w:history="1" r:id="rIdypn3zlcnbftzm_fc1g850">
+      <w:hyperlink w:history="1" r:id="rIduukgxdnl9b9l33gmnve5x">
         <w:r>
           <w:rPr>
             <w:u w:val="single"/>
@@ -81,7 +81,7 @@
         </w:rPr>
         <w:t xml:space="preserve"> | </w:t>
       </w:r>
-      <w:hyperlink w:history="1" r:id="rIdwwwd6hzcloz6hz82erulq">
+      <w:hyperlink w:history="1" r:id="rIdmsg6dj-kjqsvwo5s-hwdx">
         <w:r>
           <w:rPr>
             <w:u w:val="single"/>
@@ -116,7 +116,7 @@
         </w:rPr>
         <w:t xml:space="preserve"> | </w:t>
       </w:r>
-      <w:hyperlink w:history="1" r:id="rIdrh310ave5xyqlx4qycphs">
+      <w:hyperlink w:history="1" r:id="rIdoj6l9zfut1_wqbgkkizqs">
         <w:r>
           <w:rPr>
             <w:u w:val="single"/>
@@ -137,7 +137,7 @@
         </w:rPr>
         <w:t xml:space="preserve"> | </w:t>
       </w:r>
-      <w:hyperlink w:history="1" r:id="rIdfdjmihqdantnwvfiijade">
+      <w:hyperlink w:history="1" r:id="rIdpstdvvudh_2z-f7gdz0ch">
         <w:r>
           <w:rPr>
             <w:u w:val="single"/>
@@ -852,7 +852,7 @@
         </w:rPr>
         <w:t xml:space="preserve">Founder &amp; Engineer — </w:t>
       </w:r>
-      <w:hyperlink w:history="1" r:id="rIdubbogcwxm9ftdoxgbafnm">
+      <w:hyperlink w:history="1" r:id="rIdnc8e5zvh4wft8j4ypbuxb">
         <w:r>
           <w:rPr>
             <w:b/>
@@ -896,7 +896,7 @@
           <w:szCs w:val="22"/>
           <w:rFonts w:ascii="Calibri" w:cs="Calibri" w:eastAsia="Calibri" w:hAnsi="Calibri"/>
         </w:rPr>
-        <w:t xml:space="preserve">AI-assisted exam prep platform for Indian students. Next.js 15 on a self-hosted PocketBase backend, with a provider-routed LLM layer (Anthropic Claude, NVIDIA) behind a per-user token budget and schema-validated output. Hosted on a $35/month AWS stack with a Bubblewrap-wrapped Android TWA. 20+ paying users in beta. Engineering writeup at prepatlas.in/engineering.</w:t>
+        <w:t xml:space="preserve">AI-assisted exam prep platform for Indian students. Next.js 15 on a self-hosted PocketBase backend, with a provider-routed LLM layer (Anthropic Claude, NVIDIA) behind a per-user token budget and schema-validated output. Hosted on a $35/month AWS stack with a Bubblewrap-wrapped Android TWA. 20+ paying users in beta.</w:t>
       </w:r>
     </w:p>
     <w:p>
@@ -917,7 +917,7 @@
         </w:rPr>
         <w:t xml:space="preserve">Founder &amp; Engineer — </w:t>
       </w:r>
-      <w:hyperlink w:history="1" r:id="rIdf-9tv7hp5niasghmjpzfr">
+      <w:hyperlink w:history="1" r:id="rIdykucbxiji3hkpwt0y9qr5">
         <w:r>
           <w:rPr>
             <w:b/>

</xml_diff>

<commit_message>
refactor: cut both resume blurbs to two sentences
The wider product framing pushed these to four and five sentences,
which crowds the one-page variants. Each is now one sentence of what
the product is and one of how it is built. The full scope stays on the
project cards, which have the room for it.
</commit_message>
<xml_diff>
--- a/public/downloads/anirudh-vaka-resume-universal.docx
+++ b/public/downloads/anirudh-vaka-resume-universal.docx
@@ -39,7 +39,7 @@
       <w:pPr>
         <w:spacing w:after="40"/>
       </w:pPr>
-      <w:hyperlink w:history="1" r:id="rIdy013nk_m-42cykptlzsc4">
+      <w:hyperlink w:history="1" r:id="rIdtr26-ejq-071jjeu4a2bw">
         <w:r>
           <w:rPr>
             <w:u w:val="single"/>
@@ -60,7 +60,7 @@
         </w:rPr>
         <w:t xml:space="preserve"> | </w:t>
       </w:r>
-      <w:hyperlink w:history="1" r:id="rIdty03vdihuovleeuz_uuv1">
+      <w:hyperlink w:history="1" r:id="rIduoauljgvwkgcpmc243zmb">
         <w:r>
           <w:rPr>
             <w:u w:val="single"/>
@@ -81,7 +81,7 @@
         </w:rPr>
         <w:t xml:space="preserve"> | </w:t>
       </w:r>
-      <w:hyperlink w:history="1" r:id="rId3softp7f6ltmc0sohhc9x">
+      <w:hyperlink w:history="1" r:id="rIdcu-9lttq_cczmyca07vwb">
         <w:r>
           <w:rPr>
             <w:u w:val="single"/>
@@ -116,7 +116,7 @@
         </w:rPr>
         <w:t xml:space="preserve"> | </w:t>
       </w:r>
-      <w:hyperlink w:history="1" r:id="rIdlezvz5dc0jquqkvt_7kav">
+      <w:hyperlink w:history="1" r:id="rIdn0bupewaranpmv2xg20_u">
         <w:r>
           <w:rPr>
             <w:u w:val="single"/>
@@ -137,7 +137,7 @@
         </w:rPr>
         <w:t xml:space="preserve"> | </w:t>
       </w:r>
-      <w:hyperlink w:history="1" r:id="rId0tihzqxdjyubr1u4tujmd">
+      <w:hyperlink w:history="1" r:id="rIdqfouwvaerddeknuzgiwss">
         <w:r>
           <w:rPr>
             <w:u w:val="single"/>
@@ -852,7 +852,7 @@
         </w:rPr>
         <w:t xml:space="preserve">Founder &amp; Engineer — </w:t>
       </w:r>
-      <w:hyperlink w:history="1" r:id="rIddpuk158bkodv9nghooe9o">
+      <w:hyperlink w:history="1" r:id="rId6fhwr_wao3ljqrscb1ym-">
         <w:r>
           <w:rPr>
             <w:b/>
@@ -896,7 +896,7 @@
           <w:szCs w:val="22"/>
           <w:rFonts w:ascii="Calibri" w:cs="Calibri" w:eastAsia="Calibri" w:hAnsi="Calibri"/>
         </w:rPr>
-        <w:t xml:space="preserve">AI learning and career platform for Indian students. An AI tutor that teaches over chat, voice, and generated video; adaptive practice; a full exam engine (timed attempts, mark-for-review, negative marking, auto-submit); 13 role-based career tracks with mock interviews, JD analysis, and resume review; and a peer layer for doubts and study squads. Next.js 15 on a self-hosted PocketBase backend, with a provider-routed LLM layer (Anthropic Claude, NVIDIA) behind a per-user token budget and schema-validated output. Offline-capable PWA plus a Bubblewrap Android TWA, on a $35/month AWS stack. 20+ paying users in beta.</w:t>
+        <w:t xml:space="preserve">AI learning and career platform for Indian students — an AI tutor teaching over chat, voice, and generated video, adaptive practice, a timed exam engine, and 13 role-based career tracks with mock interviews and JD analysis. Next.js 15 on self-hosted PocketBase with a provider-routed LLM layer (Claude, NVIDIA) behind a per-user token budget and schema-validated output; offline-capable PWA and Android TWA on a $35/month AWS stack, 20+ paying users in beta.</w:t>
       </w:r>
     </w:p>
     <w:p>
@@ -917,7 +917,7 @@
         </w:rPr>
         <w:t xml:space="preserve">Founder &amp; Engineer — </w:t>
       </w:r>
-      <w:hyperlink w:history="1" r:id="rIda-cdsrtc2acovohofrilb">
+      <w:hyperlink w:history="1" r:id="rIdk-yhz3v59bja3tsqhsztd">
         <w:r>
           <w:rPr>
             <w:b/>
@@ -961,7 +961,7 @@
           <w:szCs w:val="22"/>
           <w:rFonts w:ascii="Calibri" w:cs="Calibri" w:eastAsia="Calibri" w:hAnsi="Calibri"/>
         </w:rPr>
-        <w:t xml:space="preserve">AI career workspace. A structured Career Vault holds verified experience once, and the AI writes, humanises, and tailors resumes from it rather than inventing history — with proof-check, JD matching, ATS analysis against Workday / Greenhouse / Lever / Taleo / iCIMS heuristics, cover letters, interview kit, and PDF export. Also ships a multi-tenant org console for colleges (cohorts, programs, certificates, missions, audit, exec dashboard). Production-grade auth (NextAuth v5, TOTP 2FA over AES-256-GCM-encrypted secrets, WebAuthn passkeys, Google OAuth), Razorpay with discriminated-union event handling, a multi-model Claude router, SES SMTP, Sentry. Deployed by GitHub Actions to a Docker Compose stack on AWS EC2 behind Cloudflare. 30–40 paying users across Free / Smart CV / Job-Hunt Pro tiers.</w:t>
+        <w:t xml:space="preserve">AI career workspace built on a structured Career Vault — verified experience stored once, with AI generation, humanisation, and JD tailoring reading from it rather than inventing history, plus ATS analysis, cover letters, and a multi-tenant console for colleges. Next.js 16 + Prisma/Postgres with NextAuth v5 (TOTP 2FA over AES-256-GCM secrets, WebAuthn passkeys), Razorpay, and a multi-model Claude router, deployed by GitHub Actions to Docker Compose on AWS EC2 behind Cloudflare; 30–40 paying users.</w:t>
       </w:r>
     </w:p>
     <w:p>

</xml_diff>